<commit_message>
Refactor essay arsenal: consolidate structure and content across multiple files, including the removal of outdated cases on US 2024 and COVID-19, and enhance the workflow and glossary sections for clarity and usability
this commit message was generated by cursor's commit message generator AI thingy

i really have run out of commit message ideas
</commit_message>
<xml_diff>
--- a/raw files/H1 GP/exam papers/prelim IN/2025 VJC P2 prelim H1 GP.docx
+++ b/raw files/H1 GP/exam papers/prelim IN/2025 VJC P2 prelim H1 GP.docx
@@ -1,6 +1,6 @@
 
 <file path=word/document.xml><?xml version="1.0" encoding="utf-8"?>
-<w:document xmlns:wpc="http://schemas.microsoft.com/office/word/2010/wordprocessingCanvas" xmlns:cx="http://schemas.microsoft.com/office/drawing/2014/chartex" xmlns:cx1="http://schemas.microsoft.com/office/drawing/2015/9/8/chartex" xmlns:cx2="http://schemas.microsoft.com/office/drawing/2015/10/21/chartex" xmlns:cx3="http://schemas.microsoft.com/office/drawing/2016/5/9/chartex" xmlns:cx4="http://schemas.microsoft.com/office/drawing/2016/5/10/chartex" xmlns:cx5="http://schemas.microsoft.com/office/drawing/2016/5/11/chartex" xmlns:cx6="http://schemas.microsoft.com/office/drawing/2016/5/12/chartex" xmlns:cx7="http://schemas.microsoft.com/office/drawing/2016/5/13/chartex" xmlns:cx8="http://schemas.microsoft.com/office/drawing/2016/5/14/chartex" xmlns:mc="http://schemas.openxmlformats.org/markup-compatibility/2006" xmlns:m="http://schemas.openxmlformats.org/officeDocument/2006/math" xmlns:aink="http://schemas.microsoft.com/office/drawing/2016/ink" xmlns:am3d="http://schemas.microsoft.com/office/drawing/2017/model3d" xmlns:oel="http://schemas.microsoft.com/office/2019/extlst" xmlns:r="http://schemas.openxmlformats.org/officeDocument/2006/relationships" xmlns:wp14="http://schemas.microsoft.com/office/word/2010/wordprocessingDrawing" xmlns:wp="http://schemas.openxmlformats.org/drawingml/2006/wordprocessingDrawing" xmlns:wpg="http://schemas.microsoft.com/office/word/2010/wordprocessingGroup" xmlns:wpi="http://schemas.microsoft.com/office/word/2010/wordprocessingInk" xmlns:wps="http://schemas.microsoft.com/office/word/2010/wordprocessingShape" xmlns:o="urn:schemas-microsoft-com:office:office" xmlns:v="urn:schemas-microsoft-com:vml" xmlns:w10="urn:schemas-microsoft-com:office:word" xmlns:w="http://schemas.openxmlformats.org/wordprocessingml/2006/main" xmlns:w14="http://schemas.microsoft.com/office/word/2010/wordml" xmlns:w15="http://schemas.microsoft.com/office/word/2012/wordml" xmlns:w16cex="http://schemas.microsoft.com/office/word/2018/wordml/cex" xmlns:w16cid="http://schemas.microsoft.com/office/word/2016/wordml/cid" xmlns:w16="http://schemas.microsoft.com/office/word/2018/wordml" xmlns:w16sdtdh="http://schemas.microsoft.com/office/word/2020/wordml/sdtdatahash" xmlns:w16sdtfl="http://schemas.microsoft.com/office/word/2024/wordml/sdtformatlock" xmlns:w16se="http://schemas.microsoft.com/office/word/2015/wordml/symex" xmlns:w16du="http://schemas.microsoft.com/office/word/2023/wordml/word16du" xmlns:wne="http://schemas.microsoft.com/office/word/2006/wordml" mc:Ignorable="w14 w15 w16se w16cid w16 w16cex w16sdtdh w16sdtfl w16du wp14">
+<w:document xmlns:wpc="http://schemas.microsoft.com/office/word/2010/wordprocessingCanvas" xmlns:cx="http://schemas.microsoft.com/office/drawing/2014/chartex" xmlns:cx1="http://schemas.microsoft.com/office/drawing/2015/9/8/chartex" xmlns:cx2="http://schemas.microsoft.com/office/drawing/2015/10/21/chartex" xmlns:cx3="http://schemas.microsoft.com/office/drawing/2016/5/9/chartex" xmlns:cx4="http://schemas.microsoft.com/office/drawing/2016/5/10/chartex" xmlns:cx5="http://schemas.microsoft.com/office/drawing/2016/5/11/chartex" xmlns:cx6="http://schemas.microsoft.com/office/drawing/2016/5/12/chartex" xmlns:cx7="http://schemas.microsoft.com/office/drawing/2016/5/13/chartex" xmlns:cx8="http://schemas.microsoft.com/office/drawing/2016/5/14/chartex" xmlns:mc="http://schemas.openxmlformats.org/markup-compatibility/2006" xmlns:aink="http://schemas.microsoft.com/office/drawing/2016/ink" xmlns:am3d="http://schemas.microsoft.com/office/drawing/2017/model3d" xmlns:o="urn:schemas-microsoft-com:office:office" xmlns:oel="http://schemas.microsoft.com/office/2019/extlst" xmlns:r="http://schemas.openxmlformats.org/officeDocument/2006/relationships" xmlns:m="http://schemas.openxmlformats.org/officeDocument/2006/math" xmlns:v="urn:schemas-microsoft-com:vml" xmlns:wp14="http://schemas.microsoft.com/office/word/2010/wordprocessingDrawing" xmlns:wp="http://schemas.openxmlformats.org/drawingml/2006/wordprocessingDrawing" xmlns:w10="urn:schemas-microsoft-com:office:word" xmlns:w="http://schemas.openxmlformats.org/wordprocessingml/2006/main" xmlns:w14="http://schemas.microsoft.com/office/word/2010/wordml" xmlns:w15="http://schemas.microsoft.com/office/word/2012/wordml" xmlns:w16cex="http://schemas.microsoft.com/office/word/2018/wordml/cex" xmlns:w16cid="http://schemas.microsoft.com/office/word/2016/wordml/cid" xmlns:w16="http://schemas.microsoft.com/office/word/2018/wordml" xmlns:w16du="http://schemas.microsoft.com/office/word/2023/wordml/word16du" xmlns:w16sdtdh="http://schemas.microsoft.com/office/word/2020/wordml/sdtdatahash" xmlns:w16sdtfl="http://schemas.microsoft.com/office/word/2024/wordml/sdtformatlock" xmlns:w16se="http://schemas.microsoft.com/office/word/2015/wordml/symex" xmlns:wpg="http://schemas.microsoft.com/office/word/2010/wordprocessingGroup" xmlns:wpi="http://schemas.microsoft.com/office/word/2010/wordprocessingInk" xmlns:wne="http://schemas.microsoft.com/office/word/2006/wordml" xmlns:wps="http://schemas.microsoft.com/office/word/2010/wordprocessingShape" mc:Ignorable="w14 w15 w16se w16cid w16 w16cex w16sdtdh w16sdtfl w16du wp14">
   <w:body>
     <w:p>
       <w:pPr>
@@ -1166,7 +1166,33 @@
               <w:rPr>
                 <w:rFonts w:ascii="Arial" w:hAnsi="Arial" w:cs="Arial"/>
               </w:rPr>
-              <w:t xml:space="preserve">In a media-saturated age characterised by ubiquitous access to digital entertainment ranging from television streaming services to social media platforms, reading endures as an intellectually stimulating activity. Despite the prevalence of these modern diversions, the sustained popularity of literature remains evident; bestselling titles such as Paula Hawkins’ </w:t>
+              <w:t xml:space="preserve">In a media-saturated age characterised by ubiquitous access to digital entertainment ranging from television streaming services to social media platforms, </w:t>
+            </w:r>
+            <w:r>
+              <w:rPr>
+                <w:rFonts w:ascii="Arial" w:hAnsi="Arial" w:cs="Arial"/>
+                <w:highlight w:val="yellow"/>
+              </w:rPr>
+              <w:t>reading endures as an intellectually stimulating activity</w:t>
+            </w:r>
+            <w:r>
+              <w:rPr>
+                <w:rFonts w:ascii="Arial" w:hAnsi="Arial" w:cs="Arial"/>
+              </w:rPr>
+              <w:t xml:space="preserve">. </w:t>
+            </w:r>
+            <w:r>
+              <w:rPr>
+                <w:rFonts w:ascii="Arial" w:hAnsi="Arial" w:cs="Arial"/>
+                <w:highlight w:val="yellow"/>
+              </w:rPr>
+              <w:t>Despite the prevalence of these modern diversions, the sustained popularity of literature remains evident</w:t>
+            </w:r>
+            <w:r>
+              <w:rPr>
+                <w:rFonts w:ascii="Arial" w:hAnsi="Arial" w:cs="Arial"/>
+              </w:rPr>
+              <w:t xml:space="preserve">; bestselling titles such as Paula Hawkins’ </w:t>
             </w:r>
             <w:r>
               <w:rPr>
@@ -1283,7 +1309,62 @@
               <w:rPr>
                 <w:rFonts w:ascii="Arial" w:hAnsi="Arial" w:cs="Arial"/>
               </w:rPr>
-              <w:t>Studies indicate that engaging in leisure reading for as little as 30 minutes per week can improve self-esteem and bolster confidence through the enhancement of literacy. For young people in particular, regular reading builds vocabulary, strengthens comprehension skills, and contributes to better academic performance across subjects.</w:t>
+              <w:t xml:space="preserve">Studies indicate that </w:t>
+            </w:r>
+            <w:r>
+              <w:rPr>
+                <w:rFonts w:ascii="Arial" w:hAnsi="Arial" w:cs="Arial"/>
+                <w:highlight w:val="yellow"/>
+              </w:rPr>
+              <w:t>engaging in leisure reading</w:t>
+            </w:r>
+            <w:r>
+              <w:rPr>
+                <w:rFonts w:ascii="Arial" w:hAnsi="Arial" w:cs="Arial"/>
+              </w:rPr>
+              <w:t xml:space="preserve"> for as little as 30 minutes per week can </w:t>
+            </w:r>
+            <w:r>
+              <w:rPr>
+                <w:rFonts w:ascii="Arial" w:hAnsi="Arial" w:cs="Arial"/>
+                <w:highlight w:val="yellow"/>
+              </w:rPr>
+              <w:t>improve self-esteem and bolster confidence through the enhancement of literacy</w:t>
+            </w:r>
+            <w:r>
+              <w:rPr>
+                <w:rFonts w:ascii="Arial" w:hAnsi="Arial" w:cs="Arial"/>
+              </w:rPr>
+              <w:t xml:space="preserve">. </w:t>
+            </w:r>
+            <w:r>
+              <w:rPr>
+                <w:rFonts w:ascii="Arial" w:hAnsi="Arial" w:cs="Arial"/>
+                <w:highlight w:val="yellow"/>
+                <w:u w:val="single"/>
+              </w:rPr>
+              <w:t>For young people</w:t>
+            </w:r>
+            <w:r>
+              <w:rPr>
+                <w:rFonts w:ascii="Arial" w:hAnsi="Arial" w:cs="Arial"/>
+                <w:u w:val="single"/>
+              </w:rPr>
+              <w:t xml:space="preserve"> in particular, </w:t>
+            </w:r>
+            <w:r>
+              <w:rPr>
+                <w:rFonts w:ascii="Arial" w:hAnsi="Arial" w:cs="Arial"/>
+                <w:highlight w:val="yellow"/>
+                <w:u w:val="single"/>
+              </w:rPr>
+              <w:t>regular reading builds vocabulary, strengthens comprehension skills, and contributes to better academic performance across subjects</w:t>
+            </w:r>
+            <w:r>
+              <w:rPr>
+                <w:rFonts w:ascii="Arial" w:hAnsi="Arial" w:cs="Arial"/>
+              </w:rPr>
+              <w:t>.</w:t>
             </w:r>
           </w:p>
           <w:p>
@@ -1388,8 +1469,28 @@
             <w:r>
               <w:rPr>
                 <w:rFonts w:ascii="Arial" w:hAnsi="Arial" w:cs="Arial"/>
-              </w:rPr>
-              <w:t xml:space="preserve">Reading stimulates the imagination and encourages original thinking because it functions as a portal into alternate realities. Although visual media such as film and television provide accessible adaptations of literary works, they do not replicate the unique mental engagement that reading elicits. For example, Kazuo Ishiguro’s </w:t>
+                <w:highlight w:val="yellow"/>
+              </w:rPr>
+              <w:t>Reading stimulates the imagination and encourages original thinking</w:t>
+            </w:r>
+            <w:r>
+              <w:rPr>
+                <w:rFonts w:ascii="Arial" w:hAnsi="Arial" w:cs="Arial"/>
+              </w:rPr>
+              <w:t xml:space="preserve"> because it functions as a portal into alternate realities. Although visual media such as film and television provide accessible adaptations of literary works, they do not replicate the </w:t>
+            </w:r>
+            <w:r>
+              <w:rPr>
+                <w:rFonts w:ascii="Arial" w:hAnsi="Arial" w:cs="Arial"/>
+                <w:highlight w:val="yellow"/>
+              </w:rPr>
+              <w:t>unique mental engagement that reading elicits</w:t>
+            </w:r>
+            <w:r>
+              <w:rPr>
+                <w:rFonts w:ascii="Arial" w:hAnsi="Arial" w:cs="Arial"/>
+              </w:rPr>
+              <w:t xml:space="preserve">. For example, Kazuo Ishiguro’s </w:t>
             </w:r>
             <w:r>
               <w:rPr>
@@ -1403,7 +1504,47 @@
               <w:rPr>
                 <w:rFonts w:ascii="Arial" w:hAnsi="Arial" w:cs="Arial"/>
               </w:rPr>
-              <w:t xml:space="preserve"> presents a quiet, haunting dystopia that loses some emotional subtlety in its film version. It is common for readers to imagine scenes and characters in more detail and depth than what is presented in a film adaptation. This is because books allow for a more personalised interpretation of the story, while films offer a predefined visual and auditory experience. </w:t>
+              <w:t xml:space="preserve"> presents a quiet, haunting dystopia that loses some emotional subtlety in its film version. It is common for </w:t>
+            </w:r>
+            <w:r>
+              <w:rPr>
+                <w:rFonts w:ascii="Arial" w:hAnsi="Arial" w:cs="Arial"/>
+                <w:highlight w:val="yellow"/>
+              </w:rPr>
+              <w:t xml:space="preserve">readers to imagine scenes and characters in more detail and depth </w:t>
+            </w:r>
+            <w:r>
+              <w:rPr>
+                <w:rFonts w:ascii="Arial" w:hAnsi="Arial" w:cs="Arial"/>
+                <w:highlight w:val="yellow"/>
+              </w:rPr>
+              <w:t>than what is presented in a film adaptation</w:t>
+            </w:r>
+            <w:r>
+              <w:rPr>
+                <w:rFonts w:ascii="Arial" w:hAnsi="Arial" w:cs="Arial"/>
+              </w:rPr>
+              <w:t xml:space="preserve">. This is because </w:t>
+            </w:r>
+            <w:r>
+              <w:rPr>
+                <w:rFonts w:ascii="Arial" w:hAnsi="Arial" w:cs="Arial"/>
+                <w:highlight w:val="yellow"/>
+              </w:rPr>
+              <w:t xml:space="preserve">books allow for a more personalised interpretation of the story, </w:t>
+            </w:r>
+            <w:r>
+              <w:rPr>
+                <w:rFonts w:ascii="Arial" w:hAnsi="Arial" w:cs="Arial"/>
+                <w:highlight w:val="yellow"/>
+              </w:rPr>
+              <w:t>while films offer a predefined visual and auditory experience</w:t>
+            </w:r>
+            <w:r>
+              <w:rPr>
+                <w:rFonts w:ascii="Arial" w:hAnsi="Arial" w:cs="Arial"/>
+              </w:rPr>
+              <w:t xml:space="preserve">. </w:t>
             </w:r>
           </w:p>
           <w:p>
@@ -1556,7 +1697,21 @@
               <w:rPr>
                 <w:rFonts w:ascii="Arial" w:hAnsi="Arial" w:cs="Arial"/>
               </w:rPr>
-              <w:t xml:space="preserve">Beyond the acknowledged cognitive benefits of reading, its impact is both broader and more profound. Reading fiction places us inside other minds and lives, some of which are very different from our own. For instance, Chimamanda Ngozi Adichie’s </w:t>
+              <w:t xml:space="preserve">Beyond the acknowledged cognitive benefits of reading, its impact is both broader and more profound. </w:t>
+            </w:r>
+            <w:r>
+              <w:rPr>
+                <w:rFonts w:ascii="Arial" w:hAnsi="Arial" w:cs="Arial"/>
+                <w:highlight w:val="yellow"/>
+                <w:u w:val="single"/>
+              </w:rPr>
+              <w:t>Reading fiction places us inside other minds and lives, some of which are very different from our own</w:t>
+            </w:r>
+            <w:r>
+              <w:rPr>
+                <w:rFonts w:ascii="Arial" w:hAnsi="Arial" w:cs="Arial"/>
+              </w:rPr>
+              <w:t xml:space="preserve">. For instance, Chimamanda Ngozi Adichie’s </w:t>
             </w:r>
             <w:r>
               <w:rPr>
@@ -1570,7 +1725,20 @@
               <w:rPr>
                 <w:rFonts w:ascii="Arial" w:hAnsi="Arial" w:cs="Arial"/>
               </w:rPr>
-              <w:t xml:space="preserve"> gives insight into the Nigerian Civil War from deeply human perspectives, something that most of us would never experience in our lifetimes. Although one might acquire factual knowledge about WWII or Victorian social conditions through academic texts, fictional representations, such as Boyne’s </w:t>
+              <w:t xml:space="preserve"> gives insight into the Nigerian Civil War from deeply human perspectives, something that most of us would never experience in our lifetimes. Although one might acquire factual knowledge about WWII or Victorian social conditions through academic texts, </w:t>
+            </w:r>
+            <w:r>
+              <w:rPr>
+                <w:rFonts w:ascii="Arial" w:hAnsi="Arial" w:cs="Arial"/>
+                <w:highlight w:val="yellow"/>
+              </w:rPr>
+              <w:t>fictional representations</w:t>
+            </w:r>
+            <w:r>
+              <w:rPr>
+                <w:rFonts w:ascii="Arial" w:hAnsi="Arial" w:cs="Arial"/>
+              </w:rPr>
+              <w:t xml:space="preserve">, such as Boyne’s </w:t>
             </w:r>
             <w:r>
               <w:rPr>
@@ -1597,8 +1765,15 @@
             <w:r>
               <w:rPr>
                 <w:rFonts w:ascii="Arial" w:hAnsi="Arial" w:cs="Arial"/>
-              </w:rPr>
-              <w:t xml:space="preserve">convey these realities with an emotional richness that pure historical texts rarely capture. </w:t>
+                <w:highlight w:val="yellow"/>
+              </w:rPr>
+              <w:t>convey these realities with an emotional richness that pure historical texts rarely capture</w:t>
+            </w:r>
+            <w:r>
+              <w:rPr>
+                <w:rFonts w:ascii="Arial" w:hAnsi="Arial" w:cs="Arial"/>
+              </w:rPr>
+              <w:t xml:space="preserve">. </w:t>
             </w:r>
           </w:p>
           <w:p>
@@ -2292,7 +2467,7 @@
 </file>
 
 <file path=word/endnotes.xml><?xml version="1.0" encoding="utf-8"?>
-<w:endnotes xmlns:wpc="http://schemas.microsoft.com/office/word/2010/wordprocessingCanvas" xmlns:cx="http://schemas.microsoft.com/office/drawing/2014/chartex" xmlns:cx1="http://schemas.microsoft.com/office/drawing/2015/9/8/chartex" xmlns:cx2="http://schemas.microsoft.com/office/drawing/2015/10/21/chartex" xmlns:cx3="http://schemas.microsoft.com/office/drawing/2016/5/9/chartex" xmlns:cx4="http://schemas.microsoft.com/office/drawing/2016/5/10/chartex" xmlns:cx5="http://schemas.microsoft.com/office/drawing/2016/5/11/chartex" xmlns:cx6="http://schemas.microsoft.com/office/drawing/2016/5/12/chartex" xmlns:cx7="http://schemas.microsoft.com/office/drawing/2016/5/13/chartex" xmlns:cx8="http://schemas.microsoft.com/office/drawing/2016/5/14/chartex" xmlns:mc="http://schemas.openxmlformats.org/markup-compatibility/2006" xmlns:m="http://schemas.openxmlformats.org/officeDocument/2006/math" xmlns:aink="http://schemas.microsoft.com/office/drawing/2016/ink" xmlns:am3d="http://schemas.microsoft.com/office/drawing/2017/model3d" xmlns:oel="http://schemas.microsoft.com/office/2019/extlst" xmlns:r="http://schemas.openxmlformats.org/officeDocument/2006/relationships" xmlns:wp14="http://schemas.microsoft.com/office/word/2010/wordprocessingDrawing" xmlns:wp="http://schemas.openxmlformats.org/drawingml/2006/wordprocessingDrawing" xmlns:wpg="http://schemas.microsoft.com/office/word/2010/wordprocessingGroup" xmlns:wpi="http://schemas.microsoft.com/office/word/2010/wordprocessingInk" xmlns:wps="http://schemas.microsoft.com/office/word/2010/wordprocessingShape" xmlns:o="urn:schemas-microsoft-com:office:office" xmlns:v="urn:schemas-microsoft-com:vml" xmlns:w10="urn:schemas-microsoft-com:office:word" xmlns:w="http://schemas.openxmlformats.org/wordprocessingml/2006/main" xmlns:w14="http://schemas.microsoft.com/office/word/2010/wordml" xmlns:w15="http://schemas.microsoft.com/office/word/2012/wordml" xmlns:w16cex="http://schemas.microsoft.com/office/word/2018/wordml/cex" xmlns:w16cid="http://schemas.microsoft.com/office/word/2016/wordml/cid" xmlns:w16="http://schemas.microsoft.com/office/word/2018/wordml" xmlns:w16sdtdh="http://schemas.microsoft.com/office/word/2020/wordml/sdtdatahash" xmlns:w16sdtfl="http://schemas.microsoft.com/office/word/2024/wordml/sdtformatlock" xmlns:w16se="http://schemas.microsoft.com/office/word/2015/wordml/symex" xmlns:w16du="http://schemas.microsoft.com/office/word/2023/wordml/word16du" xmlns:wne="http://schemas.microsoft.com/office/word/2006/wordml" mc:Ignorable="w14 w15 w16se w16cid w16 w16cex w16sdtdh w16sdtfl w16du wp14">
+<w:endnotes xmlns:wpc="http://schemas.microsoft.com/office/word/2010/wordprocessingCanvas" xmlns:cx="http://schemas.microsoft.com/office/drawing/2014/chartex" xmlns:cx1="http://schemas.microsoft.com/office/drawing/2015/9/8/chartex" xmlns:cx2="http://schemas.microsoft.com/office/drawing/2015/10/21/chartex" xmlns:cx3="http://schemas.microsoft.com/office/drawing/2016/5/9/chartex" xmlns:cx4="http://schemas.microsoft.com/office/drawing/2016/5/10/chartex" xmlns:cx5="http://schemas.microsoft.com/office/drawing/2016/5/11/chartex" xmlns:cx6="http://schemas.microsoft.com/office/drawing/2016/5/12/chartex" xmlns:cx7="http://schemas.microsoft.com/office/drawing/2016/5/13/chartex" xmlns:cx8="http://schemas.microsoft.com/office/drawing/2016/5/14/chartex" xmlns:mc="http://schemas.openxmlformats.org/markup-compatibility/2006" xmlns:aink="http://schemas.microsoft.com/office/drawing/2016/ink" xmlns:am3d="http://schemas.microsoft.com/office/drawing/2017/model3d" xmlns:o="urn:schemas-microsoft-com:office:office" xmlns:oel="http://schemas.microsoft.com/office/2019/extlst" xmlns:r="http://schemas.openxmlformats.org/officeDocument/2006/relationships" xmlns:m="http://schemas.openxmlformats.org/officeDocument/2006/math" xmlns:v="urn:schemas-microsoft-com:vml" xmlns:wp14="http://schemas.microsoft.com/office/word/2010/wordprocessingDrawing" xmlns:wp="http://schemas.openxmlformats.org/drawingml/2006/wordprocessingDrawing" xmlns:w10="urn:schemas-microsoft-com:office:word" xmlns:w="http://schemas.openxmlformats.org/wordprocessingml/2006/main" xmlns:w14="http://schemas.microsoft.com/office/word/2010/wordml" xmlns:w15="http://schemas.microsoft.com/office/word/2012/wordml" xmlns:w16cex="http://schemas.microsoft.com/office/word/2018/wordml/cex" xmlns:w16cid="http://schemas.microsoft.com/office/word/2016/wordml/cid" xmlns:w16="http://schemas.microsoft.com/office/word/2018/wordml" xmlns:w16du="http://schemas.microsoft.com/office/word/2023/wordml/word16du" xmlns:w16sdtdh="http://schemas.microsoft.com/office/word/2020/wordml/sdtdatahash" xmlns:w16sdtfl="http://schemas.microsoft.com/office/word/2024/wordml/sdtformatlock" xmlns:w16se="http://schemas.microsoft.com/office/word/2015/wordml/symex" xmlns:wpg="http://schemas.microsoft.com/office/word/2010/wordprocessingGroup" xmlns:wpi="http://schemas.microsoft.com/office/word/2010/wordprocessingInk" xmlns:wne="http://schemas.microsoft.com/office/word/2006/wordml" xmlns:wps="http://schemas.microsoft.com/office/word/2010/wordprocessingShape" mc:Ignorable="w14 w15 w16se w16cid w16 w16cex w16sdtdh w16sdtfl w16du wp14">
   <w:endnote w:type="separator" w:id="-1">
     <w:p>
       <w:r>
@@ -2311,7 +2486,7 @@
 </file>
 
 <file path=word/footer1.xml><?xml version="1.0" encoding="utf-8"?>
-<w:ftr xmlns:wpc="http://schemas.microsoft.com/office/word/2010/wordprocessingCanvas" xmlns:cx="http://schemas.microsoft.com/office/drawing/2014/chartex" xmlns:cx1="http://schemas.microsoft.com/office/drawing/2015/9/8/chartex" xmlns:cx2="http://schemas.microsoft.com/office/drawing/2015/10/21/chartex" xmlns:cx3="http://schemas.microsoft.com/office/drawing/2016/5/9/chartex" xmlns:cx4="http://schemas.microsoft.com/office/drawing/2016/5/10/chartex" xmlns:cx5="http://schemas.microsoft.com/office/drawing/2016/5/11/chartex" xmlns:cx6="http://schemas.microsoft.com/office/drawing/2016/5/12/chartex" xmlns:cx7="http://schemas.microsoft.com/office/drawing/2016/5/13/chartex" xmlns:cx8="http://schemas.microsoft.com/office/drawing/2016/5/14/chartex" xmlns:mc="http://schemas.openxmlformats.org/markup-compatibility/2006" xmlns:m="http://schemas.openxmlformats.org/officeDocument/2006/math" xmlns:aink="http://schemas.microsoft.com/office/drawing/2016/ink" xmlns:am3d="http://schemas.microsoft.com/office/drawing/2017/model3d" xmlns:oel="http://schemas.microsoft.com/office/2019/extlst" xmlns:r="http://schemas.openxmlformats.org/officeDocument/2006/relationships" xmlns:wp14="http://schemas.microsoft.com/office/word/2010/wordprocessingDrawing" xmlns:wp="http://schemas.openxmlformats.org/drawingml/2006/wordprocessingDrawing" xmlns:wpg="http://schemas.microsoft.com/office/word/2010/wordprocessingGroup" xmlns:wpi="http://schemas.microsoft.com/office/word/2010/wordprocessingInk" xmlns:wps="http://schemas.microsoft.com/office/word/2010/wordprocessingShape" xmlns:o="urn:schemas-microsoft-com:office:office" xmlns:v="urn:schemas-microsoft-com:vml" xmlns:w10="urn:schemas-microsoft-com:office:word" xmlns:w="http://schemas.openxmlformats.org/wordprocessingml/2006/main" xmlns:w14="http://schemas.microsoft.com/office/word/2010/wordml" xmlns:w15="http://schemas.microsoft.com/office/word/2012/wordml" xmlns:w16cex="http://schemas.microsoft.com/office/word/2018/wordml/cex" xmlns:w16cid="http://schemas.microsoft.com/office/word/2016/wordml/cid" xmlns:w16="http://schemas.microsoft.com/office/word/2018/wordml" xmlns:w16sdtdh="http://schemas.microsoft.com/office/word/2020/wordml/sdtdatahash" xmlns:w16sdtfl="http://schemas.microsoft.com/office/word/2024/wordml/sdtformatlock" xmlns:w16se="http://schemas.microsoft.com/office/word/2015/wordml/symex" xmlns:w16du="http://schemas.microsoft.com/office/word/2023/wordml/word16du" xmlns:wne="http://schemas.microsoft.com/office/word/2006/wordml" mc:Ignorable="w14 w15 w16se w16cid w16 w16cex w16sdtdh w16sdtfl w16du wp14">
+<w:ftr xmlns:wpc="http://schemas.microsoft.com/office/word/2010/wordprocessingCanvas" xmlns:cx="http://schemas.microsoft.com/office/drawing/2014/chartex" xmlns:cx1="http://schemas.microsoft.com/office/drawing/2015/9/8/chartex" xmlns:cx2="http://schemas.microsoft.com/office/drawing/2015/10/21/chartex" xmlns:cx3="http://schemas.microsoft.com/office/drawing/2016/5/9/chartex" xmlns:cx4="http://schemas.microsoft.com/office/drawing/2016/5/10/chartex" xmlns:cx5="http://schemas.microsoft.com/office/drawing/2016/5/11/chartex" xmlns:cx6="http://schemas.microsoft.com/office/drawing/2016/5/12/chartex" xmlns:cx7="http://schemas.microsoft.com/office/drawing/2016/5/13/chartex" xmlns:cx8="http://schemas.microsoft.com/office/drawing/2016/5/14/chartex" xmlns:mc="http://schemas.openxmlformats.org/markup-compatibility/2006" xmlns:aink="http://schemas.microsoft.com/office/drawing/2016/ink" xmlns:am3d="http://schemas.microsoft.com/office/drawing/2017/model3d" xmlns:o="urn:schemas-microsoft-com:office:office" xmlns:oel="http://schemas.microsoft.com/office/2019/extlst" xmlns:r="http://schemas.openxmlformats.org/officeDocument/2006/relationships" xmlns:m="http://schemas.openxmlformats.org/officeDocument/2006/math" xmlns:v="urn:schemas-microsoft-com:vml" xmlns:wp14="http://schemas.microsoft.com/office/word/2010/wordprocessingDrawing" xmlns:wp="http://schemas.openxmlformats.org/drawingml/2006/wordprocessingDrawing" xmlns:w10="urn:schemas-microsoft-com:office:word" xmlns:w="http://schemas.openxmlformats.org/wordprocessingml/2006/main" xmlns:w14="http://schemas.microsoft.com/office/word/2010/wordml" xmlns:w15="http://schemas.microsoft.com/office/word/2012/wordml" xmlns:w16cex="http://schemas.microsoft.com/office/word/2018/wordml/cex" xmlns:w16cid="http://schemas.microsoft.com/office/word/2016/wordml/cid" xmlns:w16="http://schemas.microsoft.com/office/word/2018/wordml" xmlns:w16du="http://schemas.microsoft.com/office/word/2023/wordml/word16du" xmlns:w16sdtdh="http://schemas.microsoft.com/office/word/2020/wordml/sdtdatahash" xmlns:w16sdtfl="http://schemas.microsoft.com/office/word/2024/wordml/sdtformatlock" xmlns:w16se="http://schemas.microsoft.com/office/word/2015/wordml/symex" xmlns:wpg="http://schemas.microsoft.com/office/word/2010/wordprocessingGroup" xmlns:wpi="http://schemas.microsoft.com/office/word/2010/wordprocessingInk" xmlns:wne="http://schemas.microsoft.com/office/word/2006/wordml" xmlns:wps="http://schemas.microsoft.com/office/word/2010/wordprocessingShape" mc:Ignorable="w14 w15 w16se w16cid w16 w16cex w16sdtdh w16sdtfl w16du wp14">
   <w:sdt>
     <w:sdtPr>
       <w:id w:val="467711458"/>
@@ -2353,7 +2528,7 @@
 </file>
 
 <file path=word/footnotes.xml><?xml version="1.0" encoding="utf-8"?>
-<w:footnotes xmlns:wpc="http://schemas.microsoft.com/office/word/2010/wordprocessingCanvas" xmlns:cx="http://schemas.microsoft.com/office/drawing/2014/chartex" xmlns:cx1="http://schemas.microsoft.com/office/drawing/2015/9/8/chartex" xmlns:cx2="http://schemas.microsoft.com/office/drawing/2015/10/21/chartex" xmlns:cx3="http://schemas.microsoft.com/office/drawing/2016/5/9/chartex" xmlns:cx4="http://schemas.microsoft.com/office/drawing/2016/5/10/chartex" xmlns:cx5="http://schemas.microsoft.com/office/drawing/2016/5/11/chartex" xmlns:cx6="http://schemas.microsoft.com/office/drawing/2016/5/12/chartex" xmlns:cx7="http://schemas.microsoft.com/office/drawing/2016/5/13/chartex" xmlns:cx8="http://schemas.microsoft.com/office/drawing/2016/5/14/chartex" xmlns:mc="http://schemas.openxmlformats.org/markup-compatibility/2006" xmlns:m="http://schemas.openxmlformats.org/officeDocument/2006/math" xmlns:aink="http://schemas.microsoft.com/office/drawing/2016/ink" xmlns:am3d="http://schemas.microsoft.com/office/drawing/2017/model3d" xmlns:oel="http://schemas.microsoft.com/office/2019/extlst" xmlns:r="http://schemas.openxmlformats.org/officeDocument/2006/relationships" xmlns:wp14="http://schemas.microsoft.com/office/word/2010/wordprocessingDrawing" xmlns:wp="http://schemas.openxmlformats.org/drawingml/2006/wordprocessingDrawing" xmlns:wpg="http://schemas.microsoft.com/office/word/2010/wordprocessingGroup" xmlns:wpi="http://schemas.microsoft.com/office/word/2010/wordprocessingInk" xmlns:wps="http://schemas.microsoft.com/office/word/2010/wordprocessingShape" xmlns:o="urn:schemas-microsoft-com:office:office" xmlns:v="urn:schemas-microsoft-com:vml" xmlns:w10="urn:schemas-microsoft-com:office:word" xmlns:w="http://schemas.openxmlformats.org/wordprocessingml/2006/main" xmlns:w14="http://schemas.microsoft.com/office/word/2010/wordml" xmlns:w15="http://schemas.microsoft.com/office/word/2012/wordml" xmlns:w16cex="http://schemas.microsoft.com/office/word/2018/wordml/cex" xmlns:w16cid="http://schemas.microsoft.com/office/word/2016/wordml/cid" xmlns:w16="http://schemas.microsoft.com/office/word/2018/wordml" xmlns:w16sdtdh="http://schemas.microsoft.com/office/word/2020/wordml/sdtdatahash" xmlns:w16sdtfl="http://schemas.microsoft.com/office/word/2024/wordml/sdtformatlock" xmlns:w16se="http://schemas.microsoft.com/office/word/2015/wordml/symex" xmlns:w16du="http://schemas.microsoft.com/office/word/2023/wordml/word16du" xmlns:wne="http://schemas.microsoft.com/office/word/2006/wordml" mc:Ignorable="w14 w15 w16se w16cid w16 w16cex w16sdtdh w16sdtfl w16du wp14">
+<w:footnotes xmlns:wpc="http://schemas.microsoft.com/office/word/2010/wordprocessingCanvas" xmlns:cx="http://schemas.microsoft.com/office/drawing/2014/chartex" xmlns:cx1="http://schemas.microsoft.com/office/drawing/2015/9/8/chartex" xmlns:cx2="http://schemas.microsoft.com/office/drawing/2015/10/21/chartex" xmlns:cx3="http://schemas.microsoft.com/office/drawing/2016/5/9/chartex" xmlns:cx4="http://schemas.microsoft.com/office/drawing/2016/5/10/chartex" xmlns:cx5="http://schemas.microsoft.com/office/drawing/2016/5/11/chartex" xmlns:cx6="http://schemas.microsoft.com/office/drawing/2016/5/12/chartex" xmlns:cx7="http://schemas.microsoft.com/office/drawing/2016/5/13/chartex" xmlns:cx8="http://schemas.microsoft.com/office/drawing/2016/5/14/chartex" xmlns:mc="http://schemas.openxmlformats.org/markup-compatibility/2006" xmlns:aink="http://schemas.microsoft.com/office/drawing/2016/ink" xmlns:am3d="http://schemas.microsoft.com/office/drawing/2017/model3d" xmlns:o="urn:schemas-microsoft-com:office:office" xmlns:oel="http://schemas.microsoft.com/office/2019/extlst" xmlns:r="http://schemas.openxmlformats.org/officeDocument/2006/relationships" xmlns:m="http://schemas.openxmlformats.org/officeDocument/2006/math" xmlns:v="urn:schemas-microsoft-com:vml" xmlns:wp14="http://schemas.microsoft.com/office/word/2010/wordprocessingDrawing" xmlns:wp="http://schemas.openxmlformats.org/drawingml/2006/wordprocessingDrawing" xmlns:w10="urn:schemas-microsoft-com:office:word" xmlns:w="http://schemas.openxmlformats.org/wordprocessingml/2006/main" xmlns:w14="http://schemas.microsoft.com/office/word/2010/wordml" xmlns:w15="http://schemas.microsoft.com/office/word/2012/wordml" xmlns:w16cex="http://schemas.microsoft.com/office/word/2018/wordml/cex" xmlns:w16cid="http://schemas.microsoft.com/office/word/2016/wordml/cid" xmlns:w16="http://schemas.microsoft.com/office/word/2018/wordml" xmlns:w16du="http://schemas.microsoft.com/office/word/2023/wordml/word16du" xmlns:w16sdtdh="http://schemas.microsoft.com/office/word/2020/wordml/sdtdatahash" xmlns:w16sdtfl="http://schemas.microsoft.com/office/word/2024/wordml/sdtformatlock" xmlns:w16se="http://schemas.microsoft.com/office/word/2015/wordml/symex" xmlns:wpg="http://schemas.microsoft.com/office/word/2010/wordprocessingGroup" xmlns:wpi="http://schemas.microsoft.com/office/word/2010/wordprocessingInk" xmlns:wne="http://schemas.microsoft.com/office/word/2006/wordml" xmlns:wps="http://schemas.microsoft.com/office/word/2010/wordprocessingShape" mc:Ignorable="w14 w15 w16se w16cid w16 w16cex w16sdtdh w16sdtfl w16du wp14">
   <w:footnote w:type="separator" w:id="-1">
     <w:p>
       <w:r>
@@ -2372,7 +2547,7 @@
 </file>
 
 <file path=word/header1.xml><?xml version="1.0" encoding="utf-8"?>
-<w:hdr xmlns:wpc="http://schemas.microsoft.com/office/word/2010/wordprocessingCanvas" xmlns:cx="http://schemas.microsoft.com/office/drawing/2014/chartex" xmlns:cx1="http://schemas.microsoft.com/office/drawing/2015/9/8/chartex" xmlns:cx2="http://schemas.microsoft.com/office/drawing/2015/10/21/chartex" xmlns:cx3="http://schemas.microsoft.com/office/drawing/2016/5/9/chartex" xmlns:cx4="http://schemas.microsoft.com/office/drawing/2016/5/10/chartex" xmlns:cx5="http://schemas.microsoft.com/office/drawing/2016/5/11/chartex" xmlns:cx6="http://schemas.microsoft.com/office/drawing/2016/5/12/chartex" xmlns:cx7="http://schemas.microsoft.com/office/drawing/2016/5/13/chartex" xmlns:cx8="http://schemas.microsoft.com/office/drawing/2016/5/14/chartex" xmlns:mc="http://schemas.openxmlformats.org/markup-compatibility/2006" xmlns:m="http://schemas.openxmlformats.org/officeDocument/2006/math" xmlns:aink="http://schemas.microsoft.com/office/drawing/2016/ink" xmlns:am3d="http://schemas.microsoft.com/office/drawing/2017/model3d" xmlns:oel="http://schemas.microsoft.com/office/2019/extlst" xmlns:r="http://schemas.openxmlformats.org/officeDocument/2006/relationships" xmlns:wp14="http://schemas.microsoft.com/office/word/2010/wordprocessingDrawing" xmlns:wp="http://schemas.openxmlformats.org/drawingml/2006/wordprocessingDrawing" xmlns:wpg="http://schemas.microsoft.com/office/word/2010/wordprocessingGroup" xmlns:wpi="http://schemas.microsoft.com/office/word/2010/wordprocessingInk" xmlns:wps="http://schemas.microsoft.com/office/word/2010/wordprocessingShape" xmlns:o="urn:schemas-microsoft-com:office:office" xmlns:v="urn:schemas-microsoft-com:vml" xmlns:w10="urn:schemas-microsoft-com:office:word" xmlns:w="http://schemas.openxmlformats.org/wordprocessingml/2006/main" xmlns:w14="http://schemas.microsoft.com/office/word/2010/wordml" xmlns:w15="http://schemas.microsoft.com/office/word/2012/wordml" xmlns:w16cex="http://schemas.microsoft.com/office/word/2018/wordml/cex" xmlns:w16cid="http://schemas.microsoft.com/office/word/2016/wordml/cid" xmlns:w16="http://schemas.microsoft.com/office/word/2018/wordml" xmlns:w16sdtdh="http://schemas.microsoft.com/office/word/2020/wordml/sdtdatahash" xmlns:w16sdtfl="http://schemas.microsoft.com/office/word/2024/wordml/sdtformatlock" xmlns:w16se="http://schemas.microsoft.com/office/word/2015/wordml/symex" xmlns:w16du="http://schemas.microsoft.com/office/word/2023/wordml/word16du" xmlns:wne="http://schemas.microsoft.com/office/word/2006/wordml" mc:Ignorable="w14 w15 w16se w16cid w16 w16cex w16sdtdh w16sdtfl w16du wp14">
+<w:hdr xmlns:wpc="http://schemas.microsoft.com/office/word/2010/wordprocessingCanvas" xmlns:cx="http://schemas.microsoft.com/office/drawing/2014/chartex" xmlns:cx1="http://schemas.microsoft.com/office/drawing/2015/9/8/chartex" xmlns:cx2="http://schemas.microsoft.com/office/drawing/2015/10/21/chartex" xmlns:cx3="http://schemas.microsoft.com/office/drawing/2016/5/9/chartex" xmlns:cx4="http://schemas.microsoft.com/office/drawing/2016/5/10/chartex" xmlns:cx5="http://schemas.microsoft.com/office/drawing/2016/5/11/chartex" xmlns:cx6="http://schemas.microsoft.com/office/drawing/2016/5/12/chartex" xmlns:cx7="http://schemas.microsoft.com/office/drawing/2016/5/13/chartex" xmlns:cx8="http://schemas.microsoft.com/office/drawing/2016/5/14/chartex" xmlns:mc="http://schemas.openxmlformats.org/markup-compatibility/2006" xmlns:aink="http://schemas.microsoft.com/office/drawing/2016/ink" xmlns:am3d="http://schemas.microsoft.com/office/drawing/2017/model3d" xmlns:o="urn:schemas-microsoft-com:office:office" xmlns:oel="http://schemas.microsoft.com/office/2019/extlst" xmlns:r="http://schemas.openxmlformats.org/officeDocument/2006/relationships" xmlns:m="http://schemas.openxmlformats.org/officeDocument/2006/math" xmlns:v="urn:schemas-microsoft-com:vml" xmlns:wp14="http://schemas.microsoft.com/office/word/2010/wordprocessingDrawing" xmlns:wp="http://schemas.openxmlformats.org/drawingml/2006/wordprocessingDrawing" xmlns:w10="urn:schemas-microsoft-com:office:word" xmlns:w="http://schemas.openxmlformats.org/wordprocessingml/2006/main" xmlns:w14="http://schemas.microsoft.com/office/word/2010/wordml" xmlns:w15="http://schemas.microsoft.com/office/word/2012/wordml" xmlns:w16cex="http://schemas.microsoft.com/office/word/2018/wordml/cex" xmlns:w16cid="http://schemas.microsoft.com/office/word/2016/wordml/cid" xmlns:w16="http://schemas.microsoft.com/office/word/2018/wordml" xmlns:w16du="http://schemas.microsoft.com/office/word/2023/wordml/word16du" xmlns:w16sdtdh="http://schemas.microsoft.com/office/word/2020/wordml/sdtdatahash" xmlns:w16sdtfl="http://schemas.microsoft.com/office/word/2024/wordml/sdtformatlock" xmlns:w16se="http://schemas.microsoft.com/office/word/2015/wordml/symex" xmlns:wpg="http://schemas.microsoft.com/office/word/2010/wordprocessingGroup" xmlns:wpi="http://schemas.microsoft.com/office/word/2010/wordprocessingInk" xmlns:wne="http://schemas.microsoft.com/office/word/2006/wordml" xmlns:wps="http://schemas.microsoft.com/office/word/2010/wordprocessingShape" mc:Ignorable="w14 w15 w16se w16cid w16 w16cex w16sdtdh w16sdtfl w16du wp14">
   <w:p>
     <w:pPr>
       <w:pStyle w:val="Header"/>
@@ -2382,7 +2557,7 @@
 </file>
 
 <file path=word/numbering.xml><?xml version="1.0" encoding="utf-8"?>
-<w:numbering xmlns:wpc="http://schemas.microsoft.com/office/word/2010/wordprocessingCanvas" xmlns:cx="http://schemas.microsoft.com/office/drawing/2014/chartex" xmlns:cx1="http://schemas.microsoft.com/office/drawing/2015/9/8/chartex" xmlns:cx2="http://schemas.microsoft.com/office/drawing/2015/10/21/chartex" xmlns:cx3="http://schemas.microsoft.com/office/drawing/2016/5/9/chartex" xmlns:cx4="http://schemas.microsoft.com/office/drawing/2016/5/10/chartex" xmlns:cx5="http://schemas.microsoft.com/office/drawing/2016/5/11/chartex" xmlns:cx6="http://schemas.microsoft.com/office/drawing/2016/5/12/chartex" xmlns:cx7="http://schemas.microsoft.com/office/drawing/2016/5/13/chartex" xmlns:cx8="http://schemas.microsoft.com/office/drawing/2016/5/14/chartex" xmlns:mc="http://schemas.openxmlformats.org/markup-compatibility/2006" xmlns:m="http://schemas.openxmlformats.org/officeDocument/2006/math" xmlns:aink="http://schemas.microsoft.com/office/drawing/2016/ink" xmlns:am3d="http://schemas.microsoft.com/office/drawing/2017/model3d" xmlns:oel="http://schemas.microsoft.com/office/2019/extlst" xmlns:r="http://schemas.openxmlformats.org/officeDocument/2006/relationships" xmlns:wp14="http://schemas.microsoft.com/office/word/2010/wordprocessingDrawing" xmlns:wp="http://schemas.openxmlformats.org/drawingml/2006/wordprocessingDrawing" xmlns:wpg="http://schemas.microsoft.com/office/word/2010/wordprocessingGroup" xmlns:wpi="http://schemas.microsoft.com/office/word/2010/wordprocessingInk" xmlns:wps="http://schemas.microsoft.com/office/word/2010/wordprocessingShape" xmlns:o="urn:schemas-microsoft-com:office:office" xmlns:v="urn:schemas-microsoft-com:vml" xmlns:w10="urn:schemas-microsoft-com:office:word" xmlns:w="http://schemas.openxmlformats.org/wordprocessingml/2006/main" xmlns:w14="http://schemas.microsoft.com/office/word/2010/wordml" xmlns:w15="http://schemas.microsoft.com/office/word/2012/wordml" xmlns:w16cex="http://schemas.microsoft.com/office/word/2018/wordml/cex" xmlns:w16cid="http://schemas.microsoft.com/office/word/2016/wordml/cid" xmlns:w16="http://schemas.microsoft.com/office/word/2018/wordml" xmlns:w16sdtdh="http://schemas.microsoft.com/office/word/2020/wordml/sdtdatahash" xmlns:w16sdtfl="http://schemas.microsoft.com/office/word/2024/wordml/sdtformatlock" xmlns:w16se="http://schemas.microsoft.com/office/word/2015/wordml/symex" xmlns:w16du="http://schemas.microsoft.com/office/word/2023/wordml/word16du" xmlns:wne="http://schemas.microsoft.com/office/word/2006/wordml" mc:Ignorable="w14 w15 w16se w16cid w16 w16cex w16sdtdh w16sdtfl w16du wp14">
+<w:numbering xmlns:wpc="http://schemas.microsoft.com/office/word/2010/wordprocessingCanvas" xmlns:cx="http://schemas.microsoft.com/office/drawing/2014/chartex" xmlns:cx1="http://schemas.microsoft.com/office/drawing/2015/9/8/chartex" xmlns:cx2="http://schemas.microsoft.com/office/drawing/2015/10/21/chartex" xmlns:cx3="http://schemas.microsoft.com/office/drawing/2016/5/9/chartex" xmlns:cx4="http://schemas.microsoft.com/office/drawing/2016/5/10/chartex" xmlns:cx5="http://schemas.microsoft.com/office/drawing/2016/5/11/chartex" xmlns:cx6="http://schemas.microsoft.com/office/drawing/2016/5/12/chartex" xmlns:cx7="http://schemas.microsoft.com/office/drawing/2016/5/13/chartex" xmlns:cx8="http://schemas.microsoft.com/office/drawing/2016/5/14/chartex" xmlns:mc="http://schemas.openxmlformats.org/markup-compatibility/2006" xmlns:aink="http://schemas.microsoft.com/office/drawing/2016/ink" xmlns:am3d="http://schemas.microsoft.com/office/drawing/2017/model3d" xmlns:o="urn:schemas-microsoft-com:office:office" xmlns:oel="http://schemas.microsoft.com/office/2019/extlst" xmlns:r="http://schemas.openxmlformats.org/officeDocument/2006/relationships" xmlns:m="http://schemas.openxmlformats.org/officeDocument/2006/math" xmlns:v="urn:schemas-microsoft-com:vml" xmlns:wp14="http://schemas.microsoft.com/office/word/2010/wordprocessingDrawing" xmlns:wp="http://schemas.openxmlformats.org/drawingml/2006/wordprocessingDrawing" xmlns:w10="urn:schemas-microsoft-com:office:word" xmlns:w="http://schemas.openxmlformats.org/wordprocessingml/2006/main" xmlns:w14="http://schemas.microsoft.com/office/word/2010/wordml" xmlns:w15="http://schemas.microsoft.com/office/word/2012/wordml" xmlns:w16cex="http://schemas.microsoft.com/office/word/2018/wordml/cex" xmlns:w16cid="http://schemas.microsoft.com/office/word/2016/wordml/cid" xmlns:w16="http://schemas.microsoft.com/office/word/2018/wordml" xmlns:w16du="http://schemas.microsoft.com/office/word/2023/wordml/word16du" xmlns:w16sdtdh="http://schemas.microsoft.com/office/word/2020/wordml/sdtdatahash" xmlns:w16sdtfl="http://schemas.microsoft.com/office/word/2024/wordml/sdtformatlock" xmlns:w16se="http://schemas.microsoft.com/office/word/2015/wordml/symex" xmlns:wpg="http://schemas.microsoft.com/office/word/2010/wordprocessingGroup" xmlns:wpi="http://schemas.microsoft.com/office/word/2010/wordprocessingInk" xmlns:wne="http://schemas.microsoft.com/office/word/2006/wordml" xmlns:wps="http://schemas.microsoft.com/office/word/2010/wordprocessingShape" mc:Ignorable="w14 w15 w16se w16cid w16 w16cex w16sdtdh w16sdtfl w16du wp14">
   <w:abstractNum w:abstractNumId="0" w15:restartNumberingAfterBreak="0">
     <w:nsid w:val="04210315"/>
     <w:multiLevelType w:val="multilevel"/>
@@ -3148,7 +3323,7 @@
 </file>
 
 <file path=word/styles.xml><?xml version="1.0" encoding="utf-8"?>
-<w:styles xmlns:mc="http://schemas.openxmlformats.org/markup-compatibility/2006" xmlns:r="http://schemas.openxmlformats.org/officeDocument/2006/relationships" xmlns:w="http://schemas.openxmlformats.org/wordprocessingml/2006/main" xmlns:w14="http://schemas.microsoft.com/office/word/2010/wordml" xmlns:w15="http://schemas.microsoft.com/office/word/2012/wordml" xmlns:w16cex="http://schemas.microsoft.com/office/word/2018/wordml/cex" xmlns:w16cid="http://schemas.microsoft.com/office/word/2016/wordml/cid" xmlns:w16="http://schemas.microsoft.com/office/word/2018/wordml" xmlns:w16sdtdh="http://schemas.microsoft.com/office/word/2020/wordml/sdtdatahash" xmlns:w16sdtfl="http://schemas.microsoft.com/office/word/2024/wordml/sdtformatlock" xmlns:w16se="http://schemas.microsoft.com/office/word/2015/wordml/symex" xmlns:w16du="http://schemas.microsoft.com/office/word/2023/wordml/word16du" mc:Ignorable="w14 w15 w16se w16cid w16 w16cex w16sdtdh w16sdtfl w16du">
+<w:styles xmlns:mc="http://schemas.openxmlformats.org/markup-compatibility/2006" xmlns:r="http://schemas.openxmlformats.org/officeDocument/2006/relationships" xmlns:w="http://schemas.openxmlformats.org/wordprocessingml/2006/main" xmlns:w14="http://schemas.microsoft.com/office/word/2010/wordml" xmlns:w15="http://schemas.microsoft.com/office/word/2012/wordml" xmlns:w16cex="http://schemas.microsoft.com/office/word/2018/wordml/cex" xmlns:w16cid="http://schemas.microsoft.com/office/word/2016/wordml/cid" xmlns:w16="http://schemas.microsoft.com/office/word/2018/wordml" xmlns:w16du="http://schemas.microsoft.com/office/word/2023/wordml/word16du" xmlns:w16sdtdh="http://schemas.microsoft.com/office/word/2020/wordml/sdtdatahash" xmlns:w16sdtfl="http://schemas.microsoft.com/office/word/2024/wordml/sdtformatlock" xmlns:w16se="http://schemas.microsoft.com/office/word/2015/wordml/symex" mc:Ignorable="w14 w15 w16se w16cid w16 w16cex w16sdtdh w16sdtfl w16du">
   <w:docDefaults>
     <w:rPrDefault>
       <w:rPr>

</xml_diff>